<commit_message>
Update 5 for add the sms option in frontend
</commit_message>
<xml_diff>
--- a/doc/backend/MAIN1.docx
+++ b/doc/backend/MAIN1.docx
@@ -16982,6 +16982,1024 @@
       </w:pPr>
       <w:r>
         <w:t>Parent Reached Home confirmation is visible to teacher and closes the daily travel cycle.</w:t>
+      </w:r>
+    </w:p>
+    <w:p>
+      <w:pPr>
+        <w:pStyle w:val="Heading2"/>
+      </w:pPr>
+      <w:r>
+        <w:t>15.6 Teacher SMS-Only Parent Alert Extension</w:t>
+      </w:r>
+    </w:p>
+    <w:p>
+      <w:r>
+        <w:t>This section extends the future backend plan for parents who may not have smartphones or may not actively use the parent app. Teacher attendance actions should trigger SMS delivery in addition to in-app state changes.</w:t>
+      </w:r>
+    </w:p>
+    <w:p>
+      <w:pPr>
+        <w:pStyle w:val="ListBullet"/>
+      </w:pPr>
+      <w:r>
+        <w:t>Backend should expose a teacher-controlled SMS notification workflow for Present, Absent, Late, Reached School, Leave School/Go Out, and Reached Home events.</w:t>
+      </w:r>
+    </w:p>
+    <w:p>
+      <w:pPr>
+        <w:pStyle w:val="ListBullet"/>
+      </w:pPr>
+      <w:r>
+        <w:t>The SMS event should be created only after an authorized teacher or admin changes a student status for the assigned class/section.</w:t>
+      </w:r>
+    </w:p>
+    <w:p>
+      <w:pPr>
+        <w:pStyle w:val="ListBullet"/>
+      </w:pPr>
+      <w:r>
+        <w:t>Each SMS must be stored as an auditable notification record with student_id, parent_id, phone_number, status_event, message_template, provider_message_id, delivery_status, sent_by, sent_at, and failure_reason.</w:t>
+      </w:r>
+    </w:p>
+    <w:p>
+      <w:pPr>
+        <w:pStyle w:val="ListBullet"/>
+      </w:pPr>
+      <w:r>
+        <w:t>SMS delivery should use a queue-first design so attendance pages remain fast even if the SMS provider is slow or temporarily unavailable.</w:t>
+      </w:r>
+    </w:p>
+    <w:p>
+      <w:pPr>
+        <w:pStyle w:val="ListBullet"/>
+      </w:pPr>
+      <w:r>
+        <w:t>The parent app should continue to receive in-app updates, but SMS must work as an independent fallback channel for non-smartphone parents.</w:t>
+      </w:r>
+    </w:p>
+    <w:p>
+      <w:pPr>
+        <w:pStyle w:val="ListBullet"/>
+      </w:pPr>
+      <w:r>
+        <w:t>Absent SMS messages should automatically open the absence reason workflow and allow staff to record a reason received by app, phone call, or office note.</w:t>
+      </w:r>
+    </w:p>
+    <w:p>
+      <w:pPr>
+        <w:pStyle w:val="ListBullet"/>
+      </w:pPr>
+      <w:r>
+        <w:t>The backend should prevent duplicate SMS spam by using idempotency keys such as student_id + school_day + status_event + status_version.</w:t>
+      </w:r>
+    </w:p>
+    <w:p>
+      <w:pPr>
+        <w:pStyle w:val="ListBullet"/>
+      </w:pPr>
+      <w:r>
+        <w:t>All SMS content must avoid sensitive medical or disciplinary detail; messages should state the safe operational status and ask the parent to contact school when needed.</w:t>
+      </w:r>
+    </w:p>
+    <w:tbl>
+      <w:tblPr>
+        <w:tblStyle w:val="TableGrid"/>
+        <w:tblW w:type="auto" w:w="0"/>
+        <w:tblLook w:firstColumn="1" w:firstRow="1" w:lastColumn="0" w:lastRow="0" w:noHBand="0" w:noVBand="1" w:val="04A0"/>
+      </w:tblPr>
+      <w:tblGrid>
+        <w:gridCol w:w="3600"/>
+        <w:gridCol w:w="3600"/>
+        <w:gridCol w:w="3600"/>
+      </w:tblGrid>
+      <w:tr>
+        <w:tc>
+          <w:tcPr>
+            <w:tcW w:type="dxa" w:w="3600"/>
+            <w:shd w:fill="E8EEF5"/>
+          </w:tcPr>
+          <w:p>
+            <w:pPr>
+              <w:spacing w:after="40"/>
+            </w:pPr>
+            <w:r>
+              <w:rPr>
+                <w:rFonts w:ascii="Calibri" w:hAnsi="Calibri"/>
+                <w:b/>
+                <w:color w:val="0B2545"/>
+                <w:sz w:val="18"/>
+              </w:rPr>
+              <w:t>Future API / Worker</w:t>
+            </w:r>
+          </w:p>
+        </w:tc>
+        <w:tc>
+          <w:tcPr>
+            <w:tcW w:type="dxa" w:w="3600"/>
+            <w:shd w:fill="E8EEF5"/>
+          </w:tcPr>
+          <w:p>
+            <w:pPr>
+              <w:spacing w:after="40"/>
+            </w:pPr>
+            <w:r>
+              <w:rPr>
+                <w:rFonts w:ascii="Calibri" w:hAnsi="Calibri"/>
+                <w:b/>
+                <w:color w:val="0B2545"/>
+                <w:sz w:val="18"/>
+              </w:rPr>
+              <w:t>Method</w:t>
+            </w:r>
+          </w:p>
+        </w:tc>
+        <w:tc>
+          <w:tcPr>
+            <w:tcW w:type="dxa" w:w="3600"/>
+            <w:shd w:fill="E8EEF5"/>
+          </w:tcPr>
+          <w:p>
+            <w:pPr>
+              <w:spacing w:after="40"/>
+            </w:pPr>
+            <w:r>
+              <w:rPr>
+                <w:rFonts w:ascii="Calibri" w:hAnsi="Calibri"/>
+                <w:b/>
+                <w:color w:val="0B2545"/>
+                <w:sz w:val="18"/>
+              </w:rPr>
+              <w:t>Purpose</w:t>
+            </w:r>
+          </w:p>
+        </w:tc>
+      </w:tr>
+      <w:tr>
+        <w:tc>
+          <w:tcPr>
+            <w:tcW w:type="dxa" w:w="3600"/>
+          </w:tcPr>
+          <w:p>
+            <w:pPr>
+              <w:spacing w:after="40"/>
+            </w:pPr>
+            <w:r>
+              <w:rPr>
+                <w:rFonts w:ascii="Calibri" w:hAnsi="Calibri"/>
+                <w:sz w:val="18"/>
+              </w:rPr>
+              <w:t>/api/v1/teacher/attendance/{student_id}/present</w:t>
+            </w:r>
+          </w:p>
+        </w:tc>
+        <w:tc>
+          <w:tcPr>
+            <w:tcW w:type="dxa" w:w="3600"/>
+          </w:tcPr>
+          <w:p>
+            <w:pPr>
+              <w:spacing w:after="40"/>
+            </w:pPr>
+            <w:r>
+              <w:rPr>
+                <w:rFonts w:ascii="Calibri" w:hAnsi="Calibri"/>
+                <w:sz w:val="18"/>
+              </w:rPr>
+              <w:t>POST</w:t>
+            </w:r>
+          </w:p>
+        </w:tc>
+        <w:tc>
+          <w:tcPr>
+            <w:tcW w:type="dxa" w:w="3600"/>
+          </w:tcPr>
+          <w:p>
+            <w:pPr>
+              <w:spacing w:after="40"/>
+            </w:pPr>
+            <w:r>
+              <w:rPr>
+                <w:rFonts w:ascii="Calibri" w:hAnsi="Calibri"/>
+                <w:sz w:val="18"/>
+              </w:rPr>
+              <w:t>Mark Present and queue parent SMS.</w:t>
+            </w:r>
+          </w:p>
+        </w:tc>
+      </w:tr>
+      <w:tr>
+        <w:tc>
+          <w:tcPr>
+            <w:tcW w:type="dxa" w:w="3600"/>
+          </w:tcPr>
+          <w:p>
+            <w:pPr>
+              <w:spacing w:after="40"/>
+            </w:pPr>
+            <w:r>
+              <w:rPr>
+                <w:rFonts w:ascii="Calibri" w:hAnsi="Calibri"/>
+                <w:sz w:val="18"/>
+              </w:rPr>
+              <w:t>/api/v1/teacher/attendance/{student_id}/absent</w:t>
+            </w:r>
+          </w:p>
+        </w:tc>
+        <w:tc>
+          <w:tcPr>
+            <w:tcW w:type="dxa" w:w="3600"/>
+          </w:tcPr>
+          <w:p>
+            <w:pPr>
+              <w:spacing w:after="40"/>
+            </w:pPr>
+            <w:r>
+              <w:rPr>
+                <w:rFonts w:ascii="Calibri" w:hAnsi="Calibri"/>
+                <w:sz w:val="18"/>
+              </w:rPr>
+              <w:t>POST</w:t>
+            </w:r>
+          </w:p>
+        </w:tc>
+        <w:tc>
+          <w:tcPr>
+            <w:tcW w:type="dxa" w:w="3600"/>
+          </w:tcPr>
+          <w:p>
+            <w:pPr>
+              <w:spacing w:after="40"/>
+            </w:pPr>
+            <w:r>
+              <w:rPr>
+                <w:rFonts w:ascii="Calibri" w:hAnsi="Calibri"/>
+                <w:sz w:val="18"/>
+              </w:rPr>
+              <w:t>Mark Absent, queue SMS, and create absence reason request.</w:t>
+            </w:r>
+          </w:p>
+        </w:tc>
+      </w:tr>
+      <w:tr>
+        <w:tc>
+          <w:tcPr>
+            <w:tcW w:type="dxa" w:w="3600"/>
+          </w:tcPr>
+          <w:p>
+            <w:pPr>
+              <w:spacing w:after="40"/>
+            </w:pPr>
+            <w:r>
+              <w:rPr>
+                <w:rFonts w:ascii="Calibri" w:hAnsi="Calibri"/>
+                <w:sz w:val="18"/>
+              </w:rPr>
+              <w:t>/api/v1/teacher/attendance/{student_id}/late</w:t>
+            </w:r>
+          </w:p>
+        </w:tc>
+        <w:tc>
+          <w:tcPr>
+            <w:tcW w:type="dxa" w:w="3600"/>
+          </w:tcPr>
+          <w:p>
+            <w:pPr>
+              <w:spacing w:after="40"/>
+            </w:pPr>
+            <w:r>
+              <w:rPr>
+                <w:rFonts w:ascii="Calibri" w:hAnsi="Calibri"/>
+                <w:sz w:val="18"/>
+              </w:rPr>
+              <w:t>POST</w:t>
+            </w:r>
+          </w:p>
+        </w:tc>
+        <w:tc>
+          <w:tcPr>
+            <w:tcW w:type="dxa" w:w="3600"/>
+          </w:tcPr>
+          <w:p>
+            <w:pPr>
+              <w:spacing w:after="40"/>
+            </w:pPr>
+            <w:r>
+              <w:rPr>
+                <w:rFonts w:ascii="Calibri" w:hAnsi="Calibri"/>
+                <w:sz w:val="18"/>
+              </w:rPr>
+              <w:t>Mark Late and queue late-arrival SMS.</w:t>
+            </w:r>
+          </w:p>
+        </w:tc>
+      </w:tr>
+      <w:tr>
+        <w:tc>
+          <w:tcPr>
+            <w:tcW w:type="dxa" w:w="3600"/>
+          </w:tcPr>
+          <w:p>
+            <w:pPr>
+              <w:spacing w:after="40"/>
+            </w:pPr>
+            <w:r>
+              <w:rPr>
+                <w:rFonts w:ascii="Calibri" w:hAnsi="Calibri"/>
+                <w:sz w:val="18"/>
+              </w:rPr>
+              <w:t>/api/v1/teacher/travel/{student_id}/reached-school</w:t>
+            </w:r>
+          </w:p>
+        </w:tc>
+        <w:tc>
+          <w:tcPr>
+            <w:tcW w:type="dxa" w:w="3600"/>
+          </w:tcPr>
+          <w:p>
+            <w:pPr>
+              <w:spacing w:after="40"/>
+            </w:pPr>
+            <w:r>
+              <w:rPr>
+                <w:rFonts w:ascii="Calibri" w:hAnsi="Calibri"/>
+                <w:sz w:val="18"/>
+              </w:rPr>
+              <w:t>POST</w:t>
+            </w:r>
+          </w:p>
+        </w:tc>
+        <w:tc>
+          <w:tcPr>
+            <w:tcW w:type="dxa" w:w="3600"/>
+          </w:tcPr>
+          <w:p>
+            <w:pPr>
+              <w:spacing w:after="40"/>
+            </w:pPr>
+            <w:r>
+              <w:rPr>
+                <w:rFonts w:ascii="Calibri" w:hAnsi="Calibri"/>
+                <w:sz w:val="18"/>
+              </w:rPr>
+              <w:t>Record Reached School and queue arrival SMS.</w:t>
+            </w:r>
+          </w:p>
+        </w:tc>
+      </w:tr>
+      <w:tr>
+        <w:tc>
+          <w:tcPr>
+            <w:tcW w:type="dxa" w:w="3600"/>
+          </w:tcPr>
+          <w:p>
+            <w:pPr>
+              <w:spacing w:after="40"/>
+            </w:pPr>
+            <w:r>
+              <w:rPr>
+                <w:rFonts w:ascii="Calibri" w:hAnsi="Calibri"/>
+                <w:sz w:val="18"/>
+              </w:rPr>
+              <w:t>/api/v1/teacher/travel/go-out</w:t>
+            </w:r>
+          </w:p>
+        </w:tc>
+        <w:tc>
+          <w:tcPr>
+            <w:tcW w:type="dxa" w:w="3600"/>
+          </w:tcPr>
+          <w:p>
+            <w:pPr>
+              <w:spacing w:after="40"/>
+            </w:pPr>
+            <w:r>
+              <w:rPr>
+                <w:rFonts w:ascii="Calibri" w:hAnsi="Calibri"/>
+                <w:sz w:val="18"/>
+              </w:rPr>
+              <w:t>POST</w:t>
+            </w:r>
+          </w:p>
+        </w:tc>
+        <w:tc>
+          <w:tcPr>
+            <w:tcW w:type="dxa" w:w="3600"/>
+          </w:tcPr>
+          <w:p>
+            <w:pPr>
+              <w:spacing w:after="40"/>
+            </w:pPr>
+            <w:r>
+              <w:rPr>
+                <w:rFonts w:ascii="Calibri" w:hAnsi="Calibri"/>
+                <w:sz w:val="18"/>
+              </w:rPr>
+              <w:t>Submit selected students leaving school and queue parent SMS per student.</w:t>
+            </w:r>
+          </w:p>
+        </w:tc>
+      </w:tr>
+      <w:tr>
+        <w:tc>
+          <w:tcPr>
+            <w:tcW w:type="dxa" w:w="3600"/>
+          </w:tcPr>
+          <w:p>
+            <w:pPr>
+              <w:spacing w:after="40"/>
+            </w:pPr>
+            <w:r>
+              <w:rPr>
+                <w:rFonts w:ascii="Calibri" w:hAnsi="Calibri"/>
+                <w:sz w:val="18"/>
+              </w:rPr>
+              <w:t>notification.sms.send</w:t>
+            </w:r>
+          </w:p>
+        </w:tc>
+        <w:tc>
+          <w:tcPr>
+            <w:tcW w:type="dxa" w:w="3600"/>
+          </w:tcPr>
+          <w:p>
+            <w:pPr>
+              <w:spacing w:after="40"/>
+            </w:pPr>
+            <w:r>
+              <w:rPr>
+                <w:rFonts w:ascii="Calibri" w:hAnsi="Calibri"/>
+                <w:sz w:val="18"/>
+              </w:rPr>
+              <w:t>Background job</w:t>
+            </w:r>
+          </w:p>
+        </w:tc>
+        <w:tc>
+          <w:tcPr>
+            <w:tcW w:type="dxa" w:w="3600"/>
+          </w:tcPr>
+          <w:p>
+            <w:pPr>
+              <w:spacing w:after="40"/>
+            </w:pPr>
+            <w:r>
+              <w:rPr>
+                <w:rFonts w:ascii="Calibri" w:hAnsi="Calibri"/>
+                <w:sz w:val="18"/>
+              </w:rPr>
+              <w:t>Send queued SMS through provider, retry safely, and update delivery status.</w:t>
+            </w:r>
+          </w:p>
+        </w:tc>
+      </w:tr>
+    </w:tbl>
+    <w:p>
+      <w:pPr>
+        <w:pStyle w:val="Heading2"/>
+      </w:pPr>
+      <w:r>
+        <w:t>15.7 SMS Security and Exception Handling Rules</w:t>
+      </w:r>
+    </w:p>
+    <w:p>
+      <w:pPr>
+        <w:pStyle w:val="ListBullet"/>
+      </w:pPr>
+      <w:r>
+        <w:t>Validate teacher assignment before allowing status SMS actions for a class or section.</w:t>
+      </w:r>
+    </w:p>
+    <w:p>
+      <w:pPr>
+        <w:pStyle w:val="ListBullet"/>
+      </w:pPr>
+      <w:r>
+        <w:t>Rate-limit bulk SMS actions per class and school day to prevent accidental repeated sends.</w:t>
+      </w:r>
+    </w:p>
+    <w:p>
+      <w:pPr>
+        <w:pStyle w:val="ListBullet"/>
+      </w:pPr>
+      <w:r>
+        <w:t>Mask phone numbers in normal logs; store full phone numbers only in encrypted notification records where required for delivery.</w:t>
+      </w:r>
+    </w:p>
+    <w:p>
+      <w:pPr>
+        <w:pStyle w:val="ListBullet"/>
+      </w:pPr>
+      <w:r>
+        <w:t>If the SMS provider fails, mark the notification as failed, show a safe teacher message, and retry through the queue according to policy.</w:t>
+      </w:r>
+    </w:p>
+    <w:p>
+      <w:pPr>
+        <w:pStyle w:val="ListBullet"/>
+      </w:pPr>
+      <w:r>
+        <w:t>Keep notification audit records immutable so main admin and school admin can review who sent status messages and when.</w:t>
+      </w:r>
+    </w:p>
+    <w:p>
+      <w:pPr>
+        <w:pStyle w:val="Heading2"/>
+      </w:pPr>
+      <w:r>
+        <w:t>15.8 Teacher Student Management Backend Plan</w:t>
+      </w:r>
+    </w:p>
+    <w:p>
+      <w:r>
+        <w:t>This section records the future backend plan for the Teacher Portal My Students page. The current implementation is frontend-only; backend work should later replace localStorage with authorized class-incharge APIs.</w:t>
+      </w:r>
+    </w:p>
+    <w:p>
+      <w:pPr>
+        <w:pStyle w:val="ListBullet"/>
+      </w:pPr>
+      <w:r>
+        <w:t>Only the assigned class incharge teacher should be allowed to add, edit, or request removal of students in the assigned class/section.</w:t>
+      </w:r>
+    </w:p>
+    <w:p>
+      <w:pPr>
+        <w:pStyle w:val="ListBullet"/>
+      </w:pPr>
+      <w:r>
+        <w:t>School admin and main admin should retain override access for student assignment, transfer, promotion, and deletion approval.</w:t>
+      </w:r>
+    </w:p>
+    <w:p>
+      <w:pPr>
+        <w:pStyle w:val="ListBullet"/>
+      </w:pPr>
+      <w:r>
+        <w:t>The backend should prevent duplicate student creation by checking student identifier, school ID, class/section, guardian phone, and active academic year.</w:t>
+      </w:r>
+    </w:p>
+    <w:p>
+      <w:pPr>
+        <w:pStyle w:val="ListBullet"/>
+      </w:pPr>
+      <w:r>
+        <w:t>Remove actions should be audit logged and preferably soft-delete or unassign from class instead of permanently deleting the student record.</w:t>
+      </w:r>
+    </w:p>
+    <w:p>
+      <w:pPr>
+        <w:pStyle w:val="ListBullet"/>
+      </w:pPr>
+      <w:r>
+        <w:t>Every student edit should create an audit record with before/after field values, edited_by, role, timestamp, reason, and IP/device metadata where available.</w:t>
+      </w:r>
+    </w:p>
+    <w:p>
+      <w:pPr>
+        <w:pStyle w:val="ListBullet"/>
+      </w:pPr>
+      <w:r>
+        <w:t>Bulk Excel upload should validate each row, reject duplicates, and return a row-level import report to the frontend.</w:t>
+      </w:r>
+    </w:p>
+    <w:tbl>
+      <w:tblPr>
+        <w:tblStyle w:val="TableGrid"/>
+        <w:tblW w:type="auto" w:w="0"/>
+        <w:tblLook w:firstColumn="1" w:firstRow="1" w:lastColumn="0" w:lastRow="0" w:noHBand="0" w:noVBand="1" w:val="04A0"/>
+      </w:tblPr>
+      <w:tblGrid>
+        <w:gridCol w:w="3600"/>
+        <w:gridCol w:w="3600"/>
+        <w:gridCol w:w="3600"/>
+      </w:tblGrid>
+      <w:tr>
+        <w:tc>
+          <w:tcPr>
+            <w:tcW w:type="dxa" w:w="3600"/>
+            <w:shd w:fill="E8EEF5"/>
+          </w:tcPr>
+          <w:p>
+            <w:pPr>
+              <w:spacing w:after="40"/>
+            </w:pPr>
+            <w:r>
+              <w:rPr>
+                <w:rFonts w:ascii="Calibri" w:hAnsi="Calibri"/>
+                <w:b/>
+                <w:color w:val="0B2545"/>
+                <w:sz w:val="18"/>
+              </w:rPr>
+              <w:t>Future API</w:t>
+            </w:r>
+          </w:p>
+        </w:tc>
+        <w:tc>
+          <w:tcPr>
+            <w:tcW w:type="dxa" w:w="3600"/>
+            <w:shd w:fill="E8EEF5"/>
+          </w:tcPr>
+          <w:p>
+            <w:pPr>
+              <w:spacing w:after="40"/>
+            </w:pPr>
+            <w:r>
+              <w:rPr>
+                <w:rFonts w:ascii="Calibri" w:hAnsi="Calibri"/>
+                <w:b/>
+                <w:color w:val="0B2545"/>
+                <w:sz w:val="18"/>
+              </w:rPr>
+              <w:t>Method</w:t>
+            </w:r>
+          </w:p>
+        </w:tc>
+        <w:tc>
+          <w:tcPr>
+            <w:tcW w:type="dxa" w:w="3600"/>
+            <w:shd w:fill="E8EEF5"/>
+          </w:tcPr>
+          <w:p>
+            <w:pPr>
+              <w:spacing w:after="40"/>
+            </w:pPr>
+            <w:r>
+              <w:rPr>
+                <w:rFonts w:ascii="Calibri" w:hAnsi="Calibri"/>
+                <w:b/>
+                <w:color w:val="0B2545"/>
+                <w:sz w:val="18"/>
+              </w:rPr>
+              <w:t>Purpose</w:t>
+            </w:r>
+          </w:p>
+        </w:tc>
+      </w:tr>
+      <w:tr>
+        <w:tc>
+          <w:tcPr>
+            <w:tcW w:type="dxa" w:w="3600"/>
+          </w:tcPr>
+          <w:p>
+            <w:pPr>
+              <w:spacing w:after="40"/>
+            </w:pPr>
+            <w:r>
+              <w:rPr>
+                <w:rFonts w:ascii="Calibri" w:hAnsi="Calibri"/>
+                <w:sz w:val="18"/>
+              </w:rPr>
+              <w:t>/api/v1/teacher/classes/{class_id}/students</w:t>
+            </w:r>
+          </w:p>
+        </w:tc>
+        <w:tc>
+          <w:tcPr>
+            <w:tcW w:type="dxa" w:w="3600"/>
+          </w:tcPr>
+          <w:p>
+            <w:pPr>
+              <w:spacing w:after="40"/>
+            </w:pPr>
+            <w:r>
+              <w:rPr>
+                <w:rFonts w:ascii="Calibri" w:hAnsi="Calibri"/>
+                <w:sz w:val="18"/>
+              </w:rPr>
+              <w:t>GET</w:t>
+            </w:r>
+          </w:p>
+        </w:tc>
+        <w:tc>
+          <w:tcPr>
+            <w:tcW w:type="dxa" w:w="3600"/>
+          </w:tcPr>
+          <w:p>
+            <w:pPr>
+              <w:spacing w:after="40"/>
+            </w:pPr>
+            <w:r>
+              <w:rPr>
+                <w:rFonts w:ascii="Calibri" w:hAnsi="Calibri"/>
+                <w:sz w:val="18"/>
+              </w:rPr>
+              <w:t>List students assigned to the teacher class/section.</w:t>
+            </w:r>
+          </w:p>
+        </w:tc>
+      </w:tr>
+      <w:tr>
+        <w:tc>
+          <w:tcPr>
+            <w:tcW w:type="dxa" w:w="3600"/>
+          </w:tcPr>
+          <w:p>
+            <w:pPr>
+              <w:spacing w:after="40"/>
+            </w:pPr>
+            <w:r>
+              <w:rPr>
+                <w:rFonts w:ascii="Calibri" w:hAnsi="Calibri"/>
+                <w:sz w:val="18"/>
+              </w:rPr>
+              <w:t>/api/v1/teacher/classes/{class_id}/students</w:t>
+            </w:r>
+          </w:p>
+        </w:tc>
+        <w:tc>
+          <w:tcPr>
+            <w:tcW w:type="dxa" w:w="3600"/>
+          </w:tcPr>
+          <w:p>
+            <w:pPr>
+              <w:spacing w:after="40"/>
+            </w:pPr>
+            <w:r>
+              <w:rPr>
+                <w:rFonts w:ascii="Calibri" w:hAnsi="Calibri"/>
+                <w:sz w:val="18"/>
+              </w:rPr>
+              <w:t>POST</w:t>
+            </w:r>
+          </w:p>
+        </w:tc>
+        <w:tc>
+          <w:tcPr>
+            <w:tcW w:type="dxa" w:w="3600"/>
+          </w:tcPr>
+          <w:p>
+            <w:pPr>
+              <w:spacing w:after="40"/>
+            </w:pPr>
+            <w:r>
+              <w:rPr>
+                <w:rFonts w:ascii="Calibri" w:hAnsi="Calibri"/>
+                <w:sz w:val="18"/>
+              </w:rPr>
+              <w:t>Create or assign a student to the teacher class, subject to RBAC and duplicate checks.</w:t>
+            </w:r>
+          </w:p>
+        </w:tc>
+      </w:tr>
+      <w:tr>
+        <w:tc>
+          <w:tcPr>
+            <w:tcW w:type="dxa" w:w="3600"/>
+          </w:tcPr>
+          <w:p>
+            <w:pPr>
+              <w:spacing w:after="40"/>
+            </w:pPr>
+            <w:r>
+              <w:rPr>
+                <w:rFonts w:ascii="Calibri" w:hAnsi="Calibri"/>
+                <w:sz w:val="18"/>
+              </w:rPr>
+              <w:t>/api/v1/teacher/students/{student_id}</w:t>
+            </w:r>
+          </w:p>
+        </w:tc>
+        <w:tc>
+          <w:tcPr>
+            <w:tcW w:type="dxa" w:w="3600"/>
+          </w:tcPr>
+          <w:p>
+            <w:pPr>
+              <w:spacing w:after="40"/>
+            </w:pPr>
+            <w:r>
+              <w:rPr>
+                <w:rFonts w:ascii="Calibri" w:hAnsi="Calibri"/>
+                <w:sz w:val="18"/>
+              </w:rPr>
+              <w:t>PATCH</w:t>
+            </w:r>
+          </w:p>
+        </w:tc>
+        <w:tc>
+          <w:tcPr>
+            <w:tcW w:type="dxa" w:w="3600"/>
+          </w:tcPr>
+          <w:p>
+            <w:pPr>
+              <w:spacing w:after="40"/>
+            </w:pPr>
+            <w:r>
+              <w:rPr>
+                <w:rFonts w:ascii="Calibri" w:hAnsi="Calibri"/>
+                <w:sz w:val="18"/>
+              </w:rPr>
+              <w:t>Edit allowed student fields such as guardian contact, note, status, and transport/medical flags.</w:t>
+            </w:r>
+          </w:p>
+        </w:tc>
+      </w:tr>
+      <w:tr>
+        <w:tc>
+          <w:tcPr>
+            <w:tcW w:type="dxa" w:w="3600"/>
+          </w:tcPr>
+          <w:p>
+            <w:pPr>
+              <w:spacing w:after="40"/>
+            </w:pPr>
+            <w:r>
+              <w:rPr>
+                <w:rFonts w:ascii="Calibri" w:hAnsi="Calibri"/>
+                <w:sz w:val="18"/>
+              </w:rPr>
+              <w:t>/api/v1/teacher/students/{student_id}/remove-request</w:t>
+            </w:r>
+          </w:p>
+        </w:tc>
+        <w:tc>
+          <w:tcPr>
+            <w:tcW w:type="dxa" w:w="3600"/>
+          </w:tcPr>
+          <w:p>
+            <w:pPr>
+              <w:spacing w:after="40"/>
+            </w:pPr>
+            <w:r>
+              <w:rPr>
+                <w:rFonts w:ascii="Calibri" w:hAnsi="Calibri"/>
+                <w:sz w:val="18"/>
+              </w:rPr>
+              <w:t>POST</w:t>
+            </w:r>
+          </w:p>
+        </w:tc>
+        <w:tc>
+          <w:tcPr>
+            <w:tcW w:type="dxa" w:w="3600"/>
+          </w:tcPr>
+          <w:p>
+            <w:pPr>
+              <w:spacing w:after="40"/>
+            </w:pPr>
+            <w:r>
+              <w:rPr>
+                <w:rFonts w:ascii="Calibri" w:hAnsi="Calibri"/>
+                <w:sz w:val="18"/>
+              </w:rPr>
+              <w:t>Request removal or unassignment with admin approval and audit trail.</w:t>
+            </w:r>
+          </w:p>
+        </w:tc>
+      </w:tr>
+      <w:tr>
+        <w:tc>
+          <w:tcPr>
+            <w:tcW w:type="dxa" w:w="3600"/>
+          </w:tcPr>
+          <w:p>
+            <w:pPr>
+              <w:spacing w:after="40"/>
+            </w:pPr>
+            <w:r>
+              <w:rPr>
+                <w:rFonts w:ascii="Calibri" w:hAnsi="Calibri"/>
+                <w:sz w:val="18"/>
+              </w:rPr>
+              <w:t>/api/v1/admin/students/{student_id}/approve-remove</w:t>
+            </w:r>
+          </w:p>
+        </w:tc>
+        <w:tc>
+          <w:tcPr>
+            <w:tcW w:type="dxa" w:w="3600"/>
+          </w:tcPr>
+          <w:p>
+            <w:pPr>
+              <w:spacing w:after="40"/>
+            </w:pPr>
+            <w:r>
+              <w:rPr>
+                <w:rFonts w:ascii="Calibri" w:hAnsi="Calibri"/>
+                <w:sz w:val="18"/>
+              </w:rPr>
+              <w:t>POST</w:t>
+            </w:r>
+          </w:p>
+        </w:tc>
+        <w:tc>
+          <w:tcPr>
+            <w:tcW w:type="dxa" w:w="3600"/>
+          </w:tcPr>
+          <w:p>
+            <w:pPr>
+              <w:spacing w:after="40"/>
+            </w:pPr>
+            <w:r>
+              <w:rPr>
+                <w:rFonts w:ascii="Calibri" w:hAnsi="Calibri"/>
+                <w:sz w:val="18"/>
+              </w:rPr>
+              <w:t>School admin/main admin approve or reject teacher removal request.</w:t>
+            </w:r>
+          </w:p>
+        </w:tc>
+      </w:tr>
+      <w:tr>
+        <w:tc>
+          <w:tcPr>
+            <w:tcW w:type="dxa" w:w="3600"/>
+          </w:tcPr>
+          <w:p>
+            <w:pPr>
+              <w:spacing w:after="40"/>
+            </w:pPr>
+            <w:r>
+              <w:rPr>
+                <w:rFonts w:ascii="Calibri" w:hAnsi="Calibri"/>
+                <w:sz w:val="18"/>
+              </w:rPr>
+              <w:t>/api/v1/teacher/student-imports</w:t>
+            </w:r>
+          </w:p>
+        </w:tc>
+        <w:tc>
+          <w:tcPr>
+            <w:tcW w:type="dxa" w:w="3600"/>
+          </w:tcPr>
+          <w:p>
+            <w:pPr>
+              <w:spacing w:after="40"/>
+            </w:pPr>
+            <w:r>
+              <w:rPr>
+                <w:rFonts w:ascii="Calibri" w:hAnsi="Calibri"/>
+                <w:sz w:val="18"/>
+              </w:rPr>
+              <w:t>POST</w:t>
+            </w:r>
+          </w:p>
+        </w:tc>
+        <w:tc>
+          <w:tcPr>
+            <w:tcW w:type="dxa" w:w="3600"/>
+          </w:tcPr>
+          <w:p>
+            <w:pPr>
+              <w:spacing w:after="40"/>
+            </w:pPr>
+            <w:r>
+              <w:rPr>
+                <w:rFonts w:ascii="Calibri" w:hAnsi="Calibri"/>
+                <w:sz w:val="18"/>
+              </w:rPr>
+              <w:t>Upload Excel/CSV student import and return validation results.</w:t>
+            </w:r>
+          </w:p>
+        </w:tc>
+      </w:tr>
+    </w:tbl>
+    <w:p>
+      <w:pPr>
+        <w:pStyle w:val="Heading2"/>
+      </w:pPr>
+      <w:r>
+        <w:t>15.9 Teacher Student Management Security Rules</w:t>
+      </w:r>
+    </w:p>
+    <w:p>
+      <w:pPr>
+        <w:pStyle w:val="ListBullet"/>
+      </w:pPr>
+      <w:r>
+        <w:t>Validate teacher-class assignment before every list, create, edit, import, or removal request.</w:t>
+      </w:r>
+    </w:p>
+    <w:p>
+      <w:pPr>
+        <w:pStyle w:val="ListBullet"/>
+      </w:pPr>
+      <w:r>
+        <w:t>Restrict sensitive fields such as medical details, parent contact, and location settings to authorized roles only.</w:t>
+      </w:r>
+    </w:p>
+    <w:p>
+      <w:pPr>
+        <w:pStyle w:val="ListBullet"/>
+      </w:pPr>
+      <w:r>
+        <w:t>Use structured validation for phone numbers, student names, class IDs, section IDs, roll numbers, and guardian information.</w:t>
+      </w:r>
+    </w:p>
+    <w:p>
+      <w:pPr>
+        <w:pStyle w:val="ListBullet"/>
+      </w:pPr>
+      <w:r>
+        <w:t>Return safe validation and permission errors to the frontend without exposing internal database details.</w:t>
+      </w:r>
+    </w:p>
+    <w:p>
+      <w:pPr>
+        <w:pStyle w:val="ListBullet"/>
+      </w:pPr>
+      <w:r>
+        <w:t>Include student management events in audit compliance reports for main admin and school admin review.</w:t>
       </w:r>
     </w:p>
     <w:sectPr>

</xml_diff>